<commit_message>
Final fase 5 diseño
</commit_message>
<xml_diff>
--- a/docs/bitacoras/leidy/BitacoraTiempo Leidy Giraldo FASE ESTRATEGIA.docx
+++ b/docs/bitacoras/leidy/BitacoraTiempo Leidy Giraldo FASE ESTRATEGIA.docx
@@ -1614,21 +1614,7 @@
               <w:rPr>
                 <w:lang w:val="es-CO"/>
               </w:rPr>
-              <w:t xml:space="preserve">Definición de </w:t>
-            </w:r>
-            <w:proofErr w:type="spellStart"/>
-            <w:r>
-              <w:rPr>
-                <w:lang w:val="es-CO"/>
-              </w:rPr>
-              <w:t>KPIs</w:t>
-            </w:r>
-            <w:proofErr w:type="spellEnd"/>
-            <w:r>
-              <w:rPr>
-                <w:lang w:val="es-CO"/>
-              </w:rPr>
-              <w:t xml:space="preserve"> y métricas de seguimiento para cada miembro y rol del equipo.</w:t>
+              <w:t>Definición de KPIs y métricas de seguimiento para cada miembro y rol del equipo.</w:t>
             </w:r>
           </w:p>
         </w:tc>
@@ -1880,21 +1866,7 @@
               <w:rPr>
                 <w:lang w:val="es-CO"/>
               </w:rPr>
-              <w:t xml:space="preserve">Integración de objetivos, alcance, metas y </w:t>
-            </w:r>
-            <w:proofErr w:type="spellStart"/>
-            <w:r>
-              <w:rPr>
-                <w:lang w:val="es-CO"/>
-              </w:rPr>
-              <w:t>KPIs</w:t>
-            </w:r>
-            <w:proofErr w:type="spellEnd"/>
-            <w:r>
-              <w:rPr>
-                <w:lang w:val="es-CO"/>
-              </w:rPr>
-              <w:t xml:space="preserve"> en un documento base para presentar al profesor.</w:t>
+              <w:t>Integración de objetivos, alcance, metas y KPIs en un documento base para presentar al profesor.</w:t>
             </w:r>
           </w:p>
         </w:tc>
@@ -3035,19 +3007,7 @@
               <w:rPr>
                 <w:lang w:val="es-CO"/>
               </w:rPr>
-              <w:t>7:</w:t>
-            </w:r>
-            <w:r>
-              <w:rPr>
-                <w:lang w:val="es-CO"/>
-              </w:rPr>
-              <w:t>3</w:t>
-            </w:r>
-            <w:r>
-              <w:rPr>
-                <w:lang w:val="es-CO"/>
-              </w:rPr>
-              <w:t>0pm</w:t>
+              <w:t>7:30pm</w:t>
             </w:r>
           </w:p>
         </w:tc>
@@ -3072,25 +3032,7 @@
               <w:rPr>
                 <w:lang w:val="es-CO"/>
               </w:rPr>
-              <w:t>8</w:t>
-            </w:r>
-            <w:r>
-              <w:rPr>
-                <w:lang w:val="es-CO"/>
-              </w:rPr>
-              <w:t>:</w:t>
-            </w:r>
-            <w:r>
-              <w:rPr>
-                <w:lang w:val="es-CO"/>
-              </w:rPr>
-              <w:t>3</w:t>
-            </w:r>
-            <w:r>
-              <w:rPr>
-                <w:lang w:val="es-CO"/>
-              </w:rPr>
-              <w:t>0pm</w:t>
+              <w:t>8:30pm</w:t>
             </w:r>
           </w:p>
         </w:tc>
@@ -3140,13 +3082,7 @@
               <w:rPr>
                 <w:lang w:val="es-CO"/>
               </w:rPr>
-              <w:t>6</w:t>
-            </w:r>
-            <w:r>
-              <w:rPr>
-                <w:lang w:val="es-CO"/>
-              </w:rPr>
-              <w:t>0min</w:t>
+              <w:t>60min</w:t>
             </w:r>
           </w:p>
         </w:tc>
@@ -3336,25 +3272,7 @@
               <w:rPr>
                 <w:lang w:val="es-CO"/>
               </w:rPr>
-              <w:t>8</w:t>
-            </w:r>
-            <w:r>
-              <w:rPr>
-                <w:lang w:val="es-CO"/>
-              </w:rPr>
-              <w:t>:</w:t>
-            </w:r>
-            <w:r>
-              <w:rPr>
-                <w:lang w:val="es-CO"/>
-              </w:rPr>
-              <w:t>3</w:t>
-            </w:r>
-            <w:r>
-              <w:rPr>
-                <w:lang w:val="es-CO"/>
-              </w:rPr>
-              <w:t>0pm</w:t>
+              <w:t>8:30pm</w:t>
             </w:r>
           </w:p>
         </w:tc>
@@ -3379,25 +3297,7 @@
               <w:rPr>
                 <w:lang w:val="es-CO"/>
               </w:rPr>
-              <w:t>9</w:t>
-            </w:r>
-            <w:r>
-              <w:rPr>
-                <w:lang w:val="es-CO"/>
-              </w:rPr>
-              <w:t>:</w:t>
-            </w:r>
-            <w:r>
-              <w:rPr>
-                <w:lang w:val="es-CO"/>
-              </w:rPr>
-              <w:t>00 4</w:t>
-            </w:r>
-            <w:r>
-              <w:rPr>
-                <w:lang w:val="es-CO"/>
-              </w:rPr>
-              <w:t>0pm</w:t>
+              <w:t>9:00 40pm</w:t>
             </w:r>
           </w:p>
         </w:tc>
@@ -3447,13 +3347,7 @@
               <w:rPr>
                 <w:lang w:val="es-CO"/>
               </w:rPr>
-              <w:t>3</w:t>
-            </w:r>
-            <w:r>
-              <w:rPr>
-                <w:lang w:val="es-CO"/>
-              </w:rPr>
-              <w:t>0min</w:t>
+              <w:t>30min</w:t>
             </w:r>
           </w:p>
         </w:tc>
@@ -3637,25 +3531,7 @@
               <w:rPr>
                 <w:lang w:val="es-CO"/>
               </w:rPr>
-              <w:t>9</w:t>
-            </w:r>
-            <w:r>
-              <w:rPr>
-                <w:lang w:val="es-CO"/>
-              </w:rPr>
-              <w:t>:</w:t>
-            </w:r>
-            <w:r>
-              <w:rPr>
-                <w:lang w:val="es-CO"/>
-              </w:rPr>
-              <w:t>0</w:t>
-            </w:r>
-            <w:r>
-              <w:rPr>
-                <w:lang w:val="es-CO"/>
-              </w:rPr>
-              <w:t>0pm</w:t>
+              <w:t>9:00pm</w:t>
             </w:r>
           </w:p>
         </w:tc>
@@ -3680,25 +3556,7 @@
               <w:rPr>
                 <w:lang w:val="es-CO"/>
               </w:rPr>
-              <w:t>9</w:t>
-            </w:r>
-            <w:r>
-              <w:rPr>
-                <w:lang w:val="es-CO"/>
-              </w:rPr>
-              <w:t>:</w:t>
-            </w:r>
-            <w:r>
-              <w:rPr>
-                <w:lang w:val="es-CO"/>
-              </w:rPr>
-              <w:t>2</w:t>
-            </w:r>
-            <w:r>
-              <w:rPr>
-                <w:lang w:val="es-CO"/>
-              </w:rPr>
-              <w:t>0pm</w:t>
+              <w:t>9:20pm</w:t>
             </w:r>
           </w:p>
         </w:tc>
@@ -3748,13 +3606,7 @@
               <w:rPr>
                 <w:lang w:val="es-CO"/>
               </w:rPr>
-              <w:t>2</w:t>
-            </w:r>
-            <w:r>
-              <w:rPr>
-                <w:lang w:val="es-CO"/>
-              </w:rPr>
-              <w:t>0min</w:t>
+              <w:t>20min</w:t>
             </w:r>
           </w:p>
         </w:tc>
@@ -3938,25 +3790,7 @@
               <w:rPr>
                 <w:lang w:val="es-CO"/>
               </w:rPr>
-              <w:t>9</w:t>
-            </w:r>
-            <w:r>
-              <w:rPr>
-                <w:lang w:val="es-CO"/>
-              </w:rPr>
-              <w:t>:</w:t>
-            </w:r>
-            <w:r>
-              <w:rPr>
-                <w:lang w:val="es-CO"/>
-              </w:rPr>
-              <w:t>2</w:t>
-            </w:r>
-            <w:r>
-              <w:rPr>
-                <w:lang w:val="es-CO"/>
-              </w:rPr>
-              <w:t>0pm</w:t>
+              <w:t>9:20pm</w:t>
             </w:r>
           </w:p>
         </w:tc>
@@ -3981,13 +3815,7 @@
               <w:rPr>
                 <w:lang w:val="es-CO"/>
               </w:rPr>
-              <w:t>9:4</w:t>
-            </w:r>
-            <w:r>
-              <w:rPr>
-                <w:lang w:val="es-CO"/>
-              </w:rPr>
-              <w:t>0pm</w:t>
+              <w:t>9:40pm</w:t>
             </w:r>
           </w:p>
         </w:tc>
@@ -4037,13 +3865,7 @@
               <w:rPr>
                 <w:lang w:val="es-CO"/>
               </w:rPr>
-              <w:t>2</w:t>
-            </w:r>
-            <w:r>
-              <w:rPr>
-                <w:lang w:val="es-CO"/>
-              </w:rPr>
-              <w:t>0min</w:t>
+              <w:t>20min</w:t>
             </w:r>
           </w:p>
         </w:tc>
@@ -4227,13 +4049,7 @@
               <w:rPr>
                 <w:lang w:val="es-CO"/>
               </w:rPr>
-              <w:t>9:4</w:t>
-            </w:r>
-            <w:r>
-              <w:rPr>
-                <w:lang w:val="es-CO"/>
-              </w:rPr>
-              <w:t>0pm</w:t>
+              <w:t>9:40pm</w:t>
             </w:r>
           </w:p>
         </w:tc>
@@ -4258,25 +4074,7 @@
               <w:rPr>
                 <w:lang w:val="es-CO"/>
               </w:rPr>
-              <w:t>10</w:t>
-            </w:r>
-            <w:r>
-              <w:rPr>
-                <w:lang w:val="es-CO"/>
-              </w:rPr>
-              <w:t>:</w:t>
-            </w:r>
-            <w:r>
-              <w:rPr>
-                <w:lang w:val="es-CO"/>
-              </w:rPr>
-              <w:t>0</w:t>
-            </w:r>
-            <w:r>
-              <w:rPr>
-                <w:lang w:val="es-CO"/>
-              </w:rPr>
-              <w:t>0pm</w:t>
+              <w:t>10:00pm</w:t>
             </w:r>
           </w:p>
         </w:tc>
@@ -4326,13 +4124,7 @@
               <w:rPr>
                 <w:lang w:val="es-CO"/>
               </w:rPr>
-              <w:t>2</w:t>
-            </w:r>
-            <w:r>
-              <w:rPr>
-                <w:lang w:val="es-CO"/>
-              </w:rPr>
-              <w:t>0min</w:t>
+              <w:t>20min</w:t>
             </w:r>
           </w:p>
         </w:tc>
@@ -4404,21 +4196,7 @@
               <w:rPr>
                 <w:lang w:val="es-CO"/>
               </w:rPr>
-              <w:t xml:space="preserve">Lista consolidada de funcionalidades clave vinculadas a cada módulo, con trazabilidad hacia los objetivos y </w:t>
-            </w:r>
-            <w:proofErr w:type="spellStart"/>
-            <w:r>
-              <w:rPr>
-                <w:lang w:val="es-CO"/>
-              </w:rPr>
-              <w:t>KPIs</w:t>
-            </w:r>
-            <w:proofErr w:type="spellEnd"/>
-            <w:r>
-              <w:rPr>
-                <w:lang w:val="es-CO"/>
-              </w:rPr>
-              <w:t xml:space="preserve"> definidos.</w:t>
+              <w:t>Lista consolidada de funcionalidades clave vinculadas a cada módulo, con trazabilidad hacia los objetivos y KPIs definidos.</w:t>
             </w:r>
           </w:p>
           <w:p>
@@ -4537,25 +4315,7 @@
               <w:rPr>
                 <w:lang w:val="es-CO"/>
               </w:rPr>
-              <w:t>10</w:t>
-            </w:r>
-            <w:r>
-              <w:rPr>
-                <w:lang w:val="es-CO"/>
-              </w:rPr>
-              <w:t>:0</w:t>
-            </w:r>
-            <w:r>
-              <w:rPr>
-                <w:lang w:val="es-CO"/>
-              </w:rPr>
-              <w:t>0</w:t>
-            </w:r>
-            <w:r>
-              <w:rPr>
-                <w:lang w:val="es-CO"/>
-              </w:rPr>
-              <w:t>pm</w:t>
+              <w:t>10:00pm</w:t>
             </w:r>
           </w:p>
         </w:tc>
@@ -4580,25 +4340,7 @@
               <w:rPr>
                 <w:lang w:val="es-CO"/>
               </w:rPr>
-              <w:t>10</w:t>
-            </w:r>
-            <w:r>
-              <w:rPr>
-                <w:lang w:val="es-CO"/>
-              </w:rPr>
-              <w:t>:</w:t>
-            </w:r>
-            <w:r>
-              <w:rPr>
-                <w:lang w:val="es-CO"/>
-              </w:rPr>
-              <w:t>20</w:t>
-            </w:r>
-            <w:r>
-              <w:rPr>
-                <w:lang w:val="es-CO"/>
-              </w:rPr>
-              <w:t>pm</w:t>
+              <w:t>10:20pm</w:t>
             </w:r>
           </w:p>
         </w:tc>
@@ -4648,13 +4390,7 @@
               <w:rPr>
                 <w:lang w:val="es-CO"/>
               </w:rPr>
-              <w:t>2</w:t>
-            </w:r>
-            <w:r>
-              <w:rPr>
-                <w:lang w:val="es-CO"/>
-              </w:rPr>
-              <w:t>0min</w:t>
+              <w:t>20min</w:t>
             </w:r>
           </w:p>
         </w:tc>
@@ -5338,6 +5074,12 @@
                 <w:lang w:val="es-CO"/>
               </w:rPr>
             </w:pPr>
+            <w:r>
+              <w:rPr>
+                <w:lang w:val="es-CO"/>
+              </w:rPr>
+              <w:t>16/09/25</w:t>
+            </w:r>
           </w:p>
         </w:tc>
         <w:tc>
@@ -5357,6 +5099,12 @@
                 <w:lang w:val="es-CO"/>
               </w:rPr>
             </w:pPr>
+            <w:r>
+              <w:rPr>
+                <w:lang w:val="es-CO"/>
+              </w:rPr>
+              <w:t>1:30PM</w:t>
+            </w:r>
           </w:p>
         </w:tc>
         <w:tc>
@@ -5376,6 +5124,12 @@
                 <w:lang w:val="es-CO"/>
               </w:rPr>
             </w:pPr>
+            <w:r>
+              <w:rPr>
+                <w:lang w:val="es-CO"/>
+              </w:rPr>
+              <w:t>2:00PM</w:t>
+            </w:r>
           </w:p>
         </w:tc>
         <w:tc>
@@ -5395,6 +5149,12 @@
                 <w:lang w:val="es-CO"/>
               </w:rPr>
             </w:pPr>
+            <w:r>
+              <w:rPr>
+                <w:lang w:val="es-CO"/>
+              </w:rPr>
+              <w:t>0min</w:t>
+            </w:r>
           </w:p>
         </w:tc>
         <w:tc>
@@ -5414,6 +5174,12 @@
                 <w:lang w:val="es-CO"/>
               </w:rPr>
             </w:pPr>
+            <w:r>
+              <w:rPr>
+                <w:lang w:val="es-CO"/>
+              </w:rPr>
+              <w:t>30min</w:t>
+            </w:r>
           </w:p>
         </w:tc>
         <w:tc>
@@ -5433,6 +5199,12 @@
                 <w:lang w:val="es-CO"/>
               </w:rPr>
             </w:pPr>
+            <w:r>
+              <w:rPr>
+                <w:lang w:val="es-CO"/>
+              </w:rPr>
+              <w:t>Seleccionar estilo de arquitectura</w:t>
+            </w:r>
           </w:p>
         </w:tc>
         <w:tc>
@@ -5453,6 +5225,12 @@
                 <w:lang w:val="es-CO"/>
               </w:rPr>
             </w:pPr>
+            <w:r>
+              <w:rPr>
+                <w:lang w:val="es-CO"/>
+              </w:rPr>
+              <w:t>Arquitectura</w:t>
+            </w:r>
           </w:p>
         </w:tc>
         <w:tc>
@@ -5472,6 +5250,12 @@
                 <w:lang w:val="es-CO"/>
               </w:rPr>
             </w:pPr>
+            <w:r>
+              <w:rPr>
+                <w:lang w:val="es-CO"/>
+              </w:rPr>
+              <w:t>Se realizo el estilo de arquitectura</w:t>
+            </w:r>
           </w:p>
         </w:tc>
         <w:tc>
@@ -5490,6 +5274,12 @@
                 <w:lang w:val="es-CO"/>
               </w:rPr>
             </w:pPr>
+            <w:r>
+              <w:rPr>
+                <w:lang w:val="es-CO"/>
+              </w:rPr>
+              <w:t xml:space="preserve">Si </w:t>
+            </w:r>
           </w:p>
         </w:tc>
         <w:tc>
@@ -5508,6 +5298,12 @@
                 <w:lang w:val="es-CO"/>
               </w:rPr>
             </w:pPr>
+            <w:r>
+              <w:rPr>
+                <w:lang w:val="es-CO"/>
+              </w:rPr>
+              <w:t>1</w:t>
+            </w:r>
           </w:p>
         </w:tc>
       </w:tr>
@@ -5533,6 +5329,12 @@
                 <w:lang w:val="es-CO"/>
               </w:rPr>
             </w:pPr>
+            <w:r>
+              <w:rPr>
+                <w:lang w:val="es-CO"/>
+              </w:rPr>
+              <w:t>16/09/25</w:t>
+            </w:r>
           </w:p>
         </w:tc>
         <w:tc>
@@ -5552,6 +5354,12 @@
                 <w:lang w:val="es-CO"/>
               </w:rPr>
             </w:pPr>
+            <w:r>
+              <w:rPr>
+                <w:lang w:val="es-CO"/>
+              </w:rPr>
+              <w:t>2:00pm</w:t>
+            </w:r>
           </w:p>
         </w:tc>
         <w:tc>
@@ -5571,6 +5379,12 @@
                 <w:lang w:val="es-CO"/>
               </w:rPr>
             </w:pPr>
+            <w:r>
+              <w:rPr>
+                <w:lang w:val="es-CO"/>
+              </w:rPr>
+              <w:t>3:00pm</w:t>
+            </w:r>
           </w:p>
         </w:tc>
         <w:tc>
@@ -5590,6 +5404,12 @@
                 <w:lang w:val="es-CO"/>
               </w:rPr>
             </w:pPr>
+            <w:r>
+              <w:rPr>
+                <w:lang w:val="es-CO"/>
+              </w:rPr>
+              <w:t>0min</w:t>
+            </w:r>
           </w:p>
         </w:tc>
         <w:tc>
@@ -5609,6 +5429,12 @@
                 <w:lang w:val="es-CO"/>
               </w:rPr>
             </w:pPr>
+            <w:r>
+              <w:rPr>
+                <w:lang w:val="es-CO"/>
+              </w:rPr>
+              <w:t>60min</w:t>
+            </w:r>
           </w:p>
         </w:tc>
         <w:tc>
@@ -5628,6 +5454,26 @@
                 <w:lang w:val="es-CO"/>
               </w:rPr>
             </w:pPr>
+            <w:r>
+              <w:rPr>
+                <w:lang w:val="es-CO"/>
+              </w:rPr>
+              <w:t xml:space="preserve">Vista de </w:t>
+            </w:r>
+            <w:proofErr w:type="gramStart"/>
+            <w:r>
+              <w:rPr>
+                <w:lang w:val="es-CO"/>
+              </w:rPr>
+              <w:t>información(</w:t>
+            </w:r>
+            <w:proofErr w:type="gramEnd"/>
+            <w:r>
+              <w:rPr>
+                <w:lang w:val="es-CO"/>
+              </w:rPr>
+              <w:t>Entidad Relación, ciclo de vida)</w:t>
+            </w:r>
           </w:p>
         </w:tc>
         <w:tc>
@@ -5648,6 +5494,12 @@
                 <w:lang w:val="es-CO"/>
               </w:rPr>
             </w:pPr>
+            <w:r>
+              <w:rPr>
+                <w:lang w:val="es-CO"/>
+              </w:rPr>
+              <w:t>ARQUITECTURA</w:t>
+            </w:r>
           </w:p>
         </w:tc>
         <w:tc>
@@ -5667,6 +5519,12 @@
                 <w:lang w:val="es-CO"/>
               </w:rPr>
             </w:pPr>
+            <w:r>
+              <w:rPr>
+                <w:lang w:val="es-CO"/>
+              </w:rPr>
+              <w:t xml:space="preserve">Se realiza la vista de información del proyecto </w:t>
+            </w:r>
           </w:p>
         </w:tc>
         <w:tc>
@@ -5685,6 +5543,12 @@
                 <w:lang w:val="es-CO"/>
               </w:rPr>
             </w:pPr>
+            <w:r>
+              <w:rPr>
+                <w:lang w:val="es-CO"/>
+              </w:rPr>
+              <w:t>SI</w:t>
+            </w:r>
           </w:p>
         </w:tc>
         <w:tc>
@@ -5703,6 +5567,12 @@
                 <w:lang w:val="es-CO"/>
               </w:rPr>
             </w:pPr>
+            <w:r>
+              <w:rPr>
+                <w:lang w:val="es-CO"/>
+              </w:rPr>
+              <w:t>1</w:t>
+            </w:r>
           </w:p>
         </w:tc>
       </w:tr>
@@ -5728,6 +5598,13 @@
                 <w:lang w:val="es-CO"/>
               </w:rPr>
             </w:pPr>
+            <w:r>
+              <w:rPr>
+                <w:lang w:val="es-CO"/>
+              </w:rPr>
+              <w:lastRenderedPageBreak/>
+              <w:t>16/09/25</w:t>
+            </w:r>
           </w:p>
         </w:tc>
         <w:tc>
@@ -5747,6 +5624,12 @@
                 <w:lang w:val="es-CO"/>
               </w:rPr>
             </w:pPr>
+            <w:r>
+              <w:rPr>
+                <w:lang w:val="es-CO"/>
+              </w:rPr>
+              <w:t>3:00pm</w:t>
+            </w:r>
           </w:p>
         </w:tc>
         <w:tc>
@@ -5766,6 +5649,12 @@
                 <w:lang w:val="es-CO"/>
               </w:rPr>
             </w:pPr>
+            <w:r>
+              <w:rPr>
+                <w:lang w:val="es-CO"/>
+              </w:rPr>
+              <w:t>3:30pm</w:t>
+            </w:r>
           </w:p>
         </w:tc>
         <w:tc>
@@ -5785,6 +5674,12 @@
                 <w:lang w:val="es-CO"/>
               </w:rPr>
             </w:pPr>
+            <w:r>
+              <w:rPr>
+                <w:lang w:val="es-CO"/>
+              </w:rPr>
+              <w:t>0min</w:t>
+            </w:r>
           </w:p>
         </w:tc>
         <w:tc>
@@ -5804,6 +5699,12 @@
                 <w:lang w:val="es-CO"/>
               </w:rPr>
             </w:pPr>
+            <w:r>
+              <w:rPr>
+                <w:lang w:val="es-CO"/>
+              </w:rPr>
+              <w:t>30min</w:t>
+            </w:r>
           </w:p>
         </w:tc>
         <w:tc>
@@ -5823,6 +5724,12 @@
                 <w:lang w:val="es-CO"/>
               </w:rPr>
             </w:pPr>
+            <w:r>
+              <w:rPr>
+                <w:lang w:val="es-CO"/>
+              </w:rPr>
+              <w:t>Vista operacional (Ad hoc o descripciones textuales)</w:t>
+            </w:r>
           </w:p>
         </w:tc>
         <w:tc>
@@ -5843,6 +5750,12 @@
                 <w:lang w:val="es-CO"/>
               </w:rPr>
             </w:pPr>
+            <w:r>
+              <w:rPr>
+                <w:lang w:val="es-CO"/>
+              </w:rPr>
+              <w:t>arquitectura</w:t>
+            </w:r>
           </w:p>
         </w:tc>
         <w:tc>
@@ -5862,6 +5775,12 @@
                 <w:lang w:val="es-CO"/>
               </w:rPr>
             </w:pPr>
+            <w:r>
+              <w:rPr>
+                <w:lang w:val="es-CO"/>
+              </w:rPr>
+              <w:t xml:space="preserve">Se realiza la vista operacional del proyecto </w:t>
+            </w:r>
           </w:p>
         </w:tc>
         <w:tc>
@@ -5880,6 +5799,12 @@
                 <w:lang w:val="es-CO"/>
               </w:rPr>
             </w:pPr>
+            <w:r>
+              <w:rPr>
+                <w:lang w:val="es-CO"/>
+              </w:rPr>
+              <w:t>SI</w:t>
+            </w:r>
           </w:p>
         </w:tc>
         <w:tc>
@@ -5898,6 +5823,12 @@
                 <w:lang w:val="es-CO"/>
               </w:rPr>
             </w:pPr>
+            <w:r>
+              <w:rPr>
+                <w:lang w:val="es-CO"/>
+              </w:rPr>
+              <w:t>1</w:t>
+            </w:r>
           </w:p>
         </w:tc>
       </w:tr>
@@ -5923,6 +5854,12 @@
                 <w:lang w:val="es-CO"/>
               </w:rPr>
             </w:pPr>
+            <w:r>
+              <w:rPr>
+                <w:lang w:val="es-CO"/>
+              </w:rPr>
+              <w:t>16/09/25</w:t>
+            </w:r>
           </w:p>
         </w:tc>
         <w:tc>
@@ -5942,6 +5879,12 @@
                 <w:lang w:val="es-CO"/>
               </w:rPr>
             </w:pPr>
+            <w:r>
+              <w:rPr>
+                <w:lang w:val="es-CO"/>
+              </w:rPr>
+              <w:t>7:00pm</w:t>
+            </w:r>
           </w:p>
         </w:tc>
         <w:tc>
@@ -5961,6 +5904,12 @@
                 <w:lang w:val="es-CO"/>
               </w:rPr>
             </w:pPr>
+            <w:r>
+              <w:rPr>
+                <w:lang w:val="es-CO"/>
+              </w:rPr>
+              <w:t>8:00pm</w:t>
+            </w:r>
           </w:p>
         </w:tc>
         <w:tc>
@@ -5980,6 +5929,12 @@
                 <w:lang w:val="es-CO"/>
               </w:rPr>
             </w:pPr>
+            <w:r>
+              <w:rPr>
+                <w:lang w:val="es-CO"/>
+              </w:rPr>
+              <w:t>0min</w:t>
+            </w:r>
           </w:p>
         </w:tc>
         <w:tc>
@@ -5999,6 +5954,12 @@
                 <w:lang w:val="es-CO"/>
               </w:rPr>
             </w:pPr>
+            <w:r>
+              <w:rPr>
+                <w:lang w:val="es-CO"/>
+              </w:rPr>
+              <w:t>60min</w:t>
+            </w:r>
           </w:p>
         </w:tc>
         <w:tc>
@@ -6018,6 +5979,12 @@
                 <w:lang w:val="es-CO"/>
               </w:rPr>
             </w:pPr>
+            <w:r>
+              <w:rPr>
+                <w:lang w:val="es-CO"/>
+              </w:rPr>
+              <w:t>Revisión del documento SDS</w:t>
+            </w:r>
           </w:p>
         </w:tc>
         <w:tc>
@@ -6038,6 +6005,12 @@
                 <w:lang w:val="es-CO"/>
               </w:rPr>
             </w:pPr>
+            <w:r>
+              <w:rPr>
+                <w:lang w:val="es-CO"/>
+              </w:rPr>
+              <w:t>Revisión</w:t>
+            </w:r>
           </w:p>
         </w:tc>
         <w:tc>
@@ -6057,6 +6030,12 @@
                 <w:lang w:val="es-CO"/>
               </w:rPr>
             </w:pPr>
+            <w:r>
+              <w:rPr>
+                <w:lang w:val="es-CO"/>
+              </w:rPr>
+              <w:t xml:space="preserve">Se revisan todos los documentos planteados en el script junto sus bitácoras para dar la aceptación </w:t>
+            </w:r>
           </w:p>
         </w:tc>
         <w:tc>
@@ -6075,6 +6054,12 @@
                 <w:lang w:val="es-CO"/>
               </w:rPr>
             </w:pPr>
+            <w:r>
+              <w:rPr>
+                <w:lang w:val="es-CO"/>
+              </w:rPr>
+              <w:t>Si</w:t>
+            </w:r>
           </w:p>
         </w:tc>
         <w:tc>
@@ -6093,6 +6078,12 @@
                 <w:lang w:val="es-CO"/>
               </w:rPr>
             </w:pPr>
+            <w:r>
+              <w:rPr>
+                <w:lang w:val="es-CO"/>
+              </w:rPr>
+              <w:t>1</w:t>
+            </w:r>
           </w:p>
         </w:tc>
       </w:tr>
@@ -6118,6 +6109,12 @@
                 <w:lang w:val="es-CO"/>
               </w:rPr>
             </w:pPr>
+            <w:r>
+              <w:rPr>
+                <w:lang w:val="es-CO"/>
+              </w:rPr>
+              <w:t>17/09/25</w:t>
+            </w:r>
           </w:p>
         </w:tc>
         <w:tc>
@@ -6137,6 +6134,12 @@
                 <w:lang w:val="es-CO"/>
               </w:rPr>
             </w:pPr>
+            <w:r>
+              <w:rPr>
+                <w:lang w:val="es-CO"/>
+              </w:rPr>
+              <w:t>9:00am</w:t>
+            </w:r>
           </w:p>
         </w:tc>
         <w:tc>
@@ -6156,6 +6159,12 @@
                 <w:lang w:val="es-CO"/>
               </w:rPr>
             </w:pPr>
+            <w:r>
+              <w:rPr>
+                <w:lang w:val="es-CO"/>
+              </w:rPr>
+              <w:t>10:00am</w:t>
+            </w:r>
           </w:p>
         </w:tc>
         <w:tc>
@@ -6175,6 +6184,12 @@
                 <w:lang w:val="es-CO"/>
               </w:rPr>
             </w:pPr>
+            <w:r>
+              <w:rPr>
+                <w:lang w:val="es-CO"/>
+              </w:rPr>
+              <w:t>0min</w:t>
+            </w:r>
           </w:p>
         </w:tc>
         <w:tc>
@@ -6194,6 +6209,12 @@
                 <w:lang w:val="es-CO"/>
               </w:rPr>
             </w:pPr>
+            <w:r>
+              <w:rPr>
+                <w:lang w:val="es-CO"/>
+              </w:rPr>
+              <w:t>60min</w:t>
+            </w:r>
           </w:p>
         </w:tc>
         <w:tc>
@@ -6213,6 +6234,12 @@
                 <w:lang w:val="es-CO"/>
               </w:rPr>
             </w:pPr>
+            <w:r>
+              <w:rPr>
+                <w:lang w:val="es-CO"/>
+              </w:rPr>
+              <w:t>Subir los documentos a la página web</w:t>
+            </w:r>
           </w:p>
         </w:tc>
         <w:tc>
@@ -6233,6 +6260,12 @@
                 <w:lang w:val="es-CO"/>
               </w:rPr>
             </w:pPr>
+            <w:r>
+              <w:rPr>
+                <w:lang w:val="es-CO"/>
+              </w:rPr>
+              <w:t>Actualización de pagina</w:t>
+            </w:r>
           </w:p>
         </w:tc>
         <w:tc>
@@ -6252,6 +6285,12 @@
                 <w:lang w:val="es-CO"/>
               </w:rPr>
             </w:pPr>
+            <w:r>
+              <w:rPr>
+                <w:lang w:val="es-CO"/>
+              </w:rPr>
+              <w:t>Se subieron todos los documentos actualizados y los que se requerían para fase estrategia</w:t>
+            </w:r>
           </w:p>
         </w:tc>
         <w:tc>
@@ -6270,6 +6309,12 @@
                 <w:lang w:val="es-CO"/>
               </w:rPr>
             </w:pPr>
+            <w:r>
+              <w:rPr>
+                <w:lang w:val="es-CO"/>
+              </w:rPr>
+              <w:t>si</w:t>
+            </w:r>
           </w:p>
         </w:tc>
         <w:tc>
@@ -6288,6 +6333,12 @@
                 <w:lang w:val="es-CO"/>
               </w:rPr>
             </w:pPr>
+            <w:r>
+              <w:rPr>
+                <w:lang w:val="es-CO"/>
+              </w:rPr>
+              <w:t>1</w:t>
+            </w:r>
           </w:p>
         </w:tc>
       </w:tr>

</xml_diff>